<commit_message>
feat(shared-replay): add durable replay store, brand updates, ADR-012 retire sentinel names
</commit_message>
<xml_diff>
--- a/dev-docs/integration/haechi-integration-document.docx
+++ b/dev-docs/integration/haechi-integration-document.docx
@@ -7345,7 +7345,33 @@
           <w:spacing w:val="0"/>
           <w:color w:val="141414"/>
         </w:rPr>
-        <w:t xml:space="preserve">This integration document operationalises the product concept described in the executive summary, technical plan, branding direction and website brief. The newer enterprise/CNI positioning and “Invisible Shield” visual system are treated as current. The earlier SMB/consumer website and blue/teal “Digital Guardian” direction require revision before implementation. Product naming should be standardised as </w:t>
+        <w:t xml:space="preserve">This integration document operationalises the product concept described in the executive summary, technical plan, branding direction and website brief. The newer enterprise/CNI positioning and “Invisible Shield” visual system are treated as current. The earlier SMB/consumer website and blue/teal “Digital Guardian” direction require revision before implementation.</w:t>
+      </w:r>
+    </w:p>
+    <w:p>
+      <w:pPr>
+        <w:spacing w:after="240"/>
+      </w:pPr>
+      <w:r>
+        <w:rPr>
+          <w:rFonts w:ascii="Arial" w:hAnsi="Arial" w:cs="Arial"/>
+          <w:sz w:val="28"/>
+          <w:sz-cs w:val="28"/>
+          <w:b/>
+          <w:spacing w:val="0"/>
+          <w:color w:val="141414"/>
+        </w:rPr>
+        <w:t xml:space="preserve">Naming.</w:t>
+      </w:r>
+      <w:r>
+        <w:rPr>
+          <w:rFonts w:ascii="Arial" w:hAnsi="Arial" w:cs="Arial"/>
+          <w:sz w:val="28"/>
+          <w:sz-cs w:val="28"/>
+          <w:spacing w:val="0"/>
+          <w:color w:val="141414"/>
+        </w:rPr>
+        <w:t xml:space="preserve"> The product is </w:t>
       </w:r>
       <w:r>
         <w:rPr>
@@ -7366,28 +7392,49 @@
           <w:spacing w:val="0"/>
           <w:color w:val="141414"/>
         </w:rPr>
-        <w:t xml:space="preserve">, with </w:t>
-      </w:r>
-      <w:r>
-        <w:rPr>
-          <w:rFonts w:ascii="Arial" w:hAnsi="Arial" w:cs="Arial"/>
-          <w:sz w:val="28"/>
-          <w:sz-cs w:val="28"/>
-          <w:b/>
-          <w:spacing w:val="0"/>
-          <w:color w:val="141414"/>
-        </w:rPr>
-        <w:t xml:space="preserve">Quantumind Ltd</w:t>
-      </w:r>
-      <w:r>
-        <w:rPr>
-          <w:rFonts w:ascii="Arial" w:hAnsi="Arial" w:cs="Arial"/>
-          <w:sz w:val="28"/>
-          <w:sz-cs w:val="28"/>
-          <w:spacing w:val="0"/>
-          <w:color w:val="141414"/>
-        </w:rPr>
-        <w:t xml:space="preserve"> as the company; “Quantumind Sentinel” and “Q-Sentinel” should be retained only if formally approved as architecture or edition names.</w:t>
+        <w:t xml:space="preserve">, a collaborative product of </w:t>
+      </w:r>
+      <w:r>
+        <w:rPr>
+          <w:rFonts w:ascii="Arial" w:hAnsi="Arial" w:cs="Arial"/>
+          <w:sz w:val="28"/>
+          <w:sz-cs w:val="28"/>
+          <w:b/>
+          <w:spacing w:val="0"/>
+          <w:color w:val="141414"/>
+        </w:rPr>
+        <w:t xml:space="preserve">Quantumind SSI</w:t>
+      </w:r>
+      <w:r>
+        <w:rPr>
+          <w:rFonts w:ascii="Arial" w:hAnsi="Arial" w:cs="Arial"/>
+          <w:sz w:val="28"/>
+          <w:sz-cs w:val="28"/>
+          <w:spacing w:val="0"/>
+          <w:color w:val="141414"/>
+        </w:rPr>
+        <w:t xml:space="preserve"> and </w:t>
+      </w:r>
+      <w:r>
+        <w:rPr>
+          <w:rFonts w:ascii="Arial" w:hAnsi="Arial" w:cs="Arial"/>
+          <w:sz w:val="28"/>
+          <w:sz-cs w:val="28"/>
+          <w:b/>
+          <w:spacing w:val="0"/>
+          <w:color w:val="141414"/>
+        </w:rPr>
+        <w:t xml:space="preserve">Haechi Internet Security Services</w:t>
+      </w:r>
+      <w:r>
+        <w:rPr>
+          <w:rFonts w:ascii="Arial" w:hAnsi="Arial" w:cs="Arial"/>
+          <w:sz w:val="28"/>
+          <w:sz-cs w:val="28"/>
+          <w:spacing w:val="0"/>
+          <w:color w:val="141414"/>
+        </w:rPr>
+        <w:t xml:space="preserve">, with development carried out under Quantumind SSI (ADR-001, Accepted 2026-08-27). The former names “Quantumind Sentinel” and “Q-Sentinel” are retired and must not be used in code, documentation, or external material; ADR-001 left that conditional and ADR-012 (Accepted 2026-08-30) closes it. The Sentinel-era layer names COL, DPCO, QSVG and ZKO are retired with them. Where this document or its historical sources refer to a Sentinel-branded architecture, read it as Haechi. This paragraph replaces the open naming question and the “Quantumind Ltd” company reference carried by v1.0 of this appendix; see dev-docs/adr/adr-012-retire-sentinel-names.md for the decision of record.</w:t>
       </w:r>
     </w:p>
     <w:p>

</xml_diff>